<commit_message>
docs: simplify defense pitch
</commit_message>
<xml_diff>
--- a/deliverables/RKNP/RKNP_речь_5_минут.docx
+++ b/deliverables/RKNP/RKNP_речь_5_минут.docx
@@ -13,7 +13,7 @@
           <w:b/>
           <w:sz w:val="40"/>
         </w:rPr>
-        <w:t>Речь к защите проекта — 5 минут</w:t>
+        <w:t>Простая речь к защите — 5 минут</w:t>
       </w:r>
     </w:p>
     <w:p>
@@ -26,7 +26,7 @@
           <w:b/>
           <w:sz w:val="30"/>
         </w:rPr>
-        <w:t>Основная версия</w:t>
+        <w:t>Основная речь</w:t>
       </w:r>
     </w:p>
     <w:p>
@@ -48,7 +48,15 @@
         <w:jc w:val="both"/>
       </w:pPr>
       <w:r>
-        <w:t>Здравствуйте, уважаемые члены комиссии. Меня зовут Саурыков Ихсан, я ученик 12D класса Назарбаевской Интеллектуальной Школы физико-математического направления города Талдыкорган. Мой проект посвящён прогнозированию фактических ошибок больших языковых моделей по динамике семантической согласованности повторных ответов.</w:t>
+        <w:t>Здравствуйте. Меня зовут Саурыков Ихсан, я учусь в 12D классе НИШ города Талдыкорган.</w:t>
+      </w:r>
+    </w:p>
+    <w:p>
+      <w:pPr>
+        <w:jc w:val="both"/>
+      </w:pPr>
+      <w:r>
+        <w:t>Мой проект посвящён ошибкам искусственного интеллекта. Я исследовал, можно ли заранее понять, что ответ языковой модели может быть неправильным.</w:t>
       </w:r>
     </w:p>
     <w:p>
@@ -70,7 +78,15 @@
         <w:jc w:val="both"/>
       </w:pPr>
       <w:r>
-        <w:t>Проблема заключается в том, что языковая модель может дать уверенный, подробный и хорошо сформулированный ответ, который при этом будет фактически неверным. Пользователь часто не видит разницы. Особенно опасно это в обучении и поиске информации, где ошибка может выглядеть убедительно.</w:t>
+        <w:t>Проблема в том, что искусственный интеллект иногда отвечает очень уверенно, но ошибается. Ответ может быть длинным, грамотным и убедительным. Поэтому человеку трудно сразу заметить ошибку.</w:t>
+      </w:r>
+    </w:p>
+    <w:p>
+      <w:pPr>
+        <w:jc w:val="both"/>
+      </w:pPr>
+      <w:r>
+        <w:t>Это особенно важно, когда школьники используют искусственный интеллект для учёбы или поиска информации.</w:t>
       </w:r>
     </w:p>
     <w:p>
@@ -92,7 +108,7 @@
         <w:jc w:val="both"/>
       </w:pPr>
       <w:r>
-        <w:t>Мой исследовательский вопрос: можно ли определить риск ошибки без доступа к внутренним вероятностям модели, используя только её ответы через API? Гипотеза состоит в том, что динамика согласованности нескольких повторных ответов даёт больше информации, чем одна итоговая оценка.</w:t>
+        <w:t>Моя идея была простой. Я задавал модели один и тот же вопрос несколько раз.</w:t>
       </w:r>
     </w:p>
     <w:p>
@@ -100,7 +116,15 @@
         <w:jc w:val="both"/>
       </w:pPr>
       <w:r>
-        <w:t>Идея простая. Мы задаём один и тот же фактологический вопрос несколько раз. Если ответы сохраняют один смысл, риск ошибки может быть ниже. Если смысл меняется, появляются конкурирующие версии или исчезает поддержка первоначального ответа, это может быть сигналом риска.</w:t>
+        <w:t>Если модель каждый раз говорит примерно одно и то же, её ответы стабильны. Если она начинает давать разные версии, это может означать, что она не уверена и риск ошибки выше.</w:t>
+      </w:r>
+    </w:p>
+    <w:p>
+      <w:pPr>
+        <w:jc w:val="both"/>
+      </w:pPr>
+      <w:r>
+        <w:t>Поэтому мой главный вопрос звучал так: можно ли использовать изменения повторных ответов, чтобы находить возможные ошибки?</w:t>
       </w:r>
     </w:p>
     <w:p>
@@ -122,7 +146,7 @@
         <w:jc w:val="both"/>
       </w:pPr>
       <w:r>
-        <w:t>Для проверки я подготовил benchmark из 100 фактов. Каждый факт представлен на английском, русском и казахском языках, имеет эталонный ответ, допустимые варианты и официальный либо первичный источник. Все 100 фактов были проверены человеком до запуска эксперимента.</w:t>
+        <w:t>Для эксперимента я подготовил 100 фактов из истории, географии, науки, культуры и Казахстана. Также были вопросы с неправильной предпосылкой. Например, вопрос мог спрашивать о событии, которого на самом деле не было.</w:t>
       </w:r>
     </w:p>
     <w:p>
@@ -130,7 +154,7 @@
         <w:jc w:val="both"/>
       </w:pPr>
       <w:r>
-        <w:t>В эксперименте участвовали три модели Groq. Для каждой комбинации факта, языка и модели был получен один основной ответ и пять повторных генераций. Всего собрано 5 400 ответов. Параметры, seed и разбиение данных были зафиксированы заранее. Разбиение 70, 15 и 15 процентов выполнялось на уровне фактов, поэтому один факт не мог одновременно оказаться в обучающей и тестовой выборках.</w:t>
+        <w:t>Каждый вопрос был записан на трёх языках: английском, русском и казахском. У каждого вопроса был правильный ответ и надёжный источник. Все факты были заранее проверены человеком.</w:t>
       </w:r>
     </w:p>
     <w:p>
@@ -138,7 +162,15 @@
         <w:jc w:val="both"/>
       </w:pPr>
       <w:r>
-        <w:t>Основные ответы размечались по строгому whole-answer правилу: если модель называла правильный ответ, но добавляла отдельный ложный факт, весь ответ считался неверным. Оборванные ответы не превращались искусственно в ошибки.</w:t>
+        <w:t>Я использовал три языковые модели. Для каждого вопроса модель давала один основной ответ и ещё пять повторных ответов. Всего было собрано 5 400 ответов.</w:t>
+      </w:r>
+    </w:p>
+    <w:p>
+      <w:pPr>
+        <w:jc w:val="both"/>
+      </w:pPr>
+      <w:r>
+        <w:t>Основной ответ проверялся полностью. Если правильное слово было указано, но рядом модель добавляла неправильный факт, такой ответ считался ошибочным.</w:t>
       </w:r>
     </w:p>
     <w:p>
@@ -160,7 +192,7 @@
         <w:jc w:val="both"/>
       </w:pPr>
       <w:r>
-        <w:t>Затем повторные ответы объединялись в смысловые группы. Для префиксов из двух, трёх, четырёх и пяти генераций вычислялись семантическая энтропия, число смысловых групп, поддержка основного ответа и изменение этих показателей. Таким образом модель получала не только финальное состояние при пяти ответах, но и траекторию его изменения.</w:t>
+        <w:t>После этого программа сравнивала смысл пяти повторных ответов.</w:t>
       </w:r>
     </w:p>
     <w:p>
@@ -168,7 +200,7 @@
         <w:jc w:val="both"/>
       </w:pPr>
       <w:r>
-        <w:t>Из 900 наблюдаемых случаев 866 имели полный набор генераций и прошли semantic grouping. После исключения 34 случаев, в которых semantic judge отметил неопределённость, в таблицу признаков вошли 832 случая.</w:t>
+        <w:t>Она проверяла три вещи. Насколько ответы похожи друг на друга. Сколько разных версий ответа появилось. И поддерживают ли повторные ответы первоначальный ответ модели.</w:t>
       </w:r>
     </w:p>
     <w:p>
@@ -176,7 +208,15 @@
         <w:jc w:val="both"/>
       </w:pPr>
       <w:r>
-        <w:t>Предварительный анализ также показал различия между моделями, категориями и языками. Поэтому они учитывались при интерпретации результата, а главным сравнением оставались динамические и статические признаки на одном и том же закрытом тесте.</w:t>
+        <w:t>Я также смотрел, как эти показатели менялись после второго, третьего, четвёртого и пятого ответа. Именно это я называю динамикой ответов.</w:t>
+      </w:r>
+    </w:p>
+    <w:p>
+      <w:pPr>
+        <w:jc w:val="both"/>
+      </w:pPr>
+      <w:r>
+        <w:t>Для итогового анализа подошли 832 случая. Данные были разделены на обучение, настройку и финальную проверку. Вопросы из финальной проверки не использовались при обучении модели.</w:t>
       </w:r>
     </w:p>
     <w:p>
@@ -198,7 +238,7 @@
         <w:jc w:val="both"/>
       </w:pPr>
       <w:r>
-        <w:t>Главный результат следующий. На locked test из 131 случая динамическая логистическая модель получила AUROC 0,879 и AUPRC 0,622. Статическая модель, которая использовала только финальные признаки при пяти генерациях, получила AUROC 0,842.</w:t>
+        <w:t>Теперь главный результат.</w:t>
       </w:r>
     </w:p>
     <w:p>
@@ -206,7 +246,39 @@
         <w:jc w:val="both"/>
       </w:pPr>
       <w:r>
-        <w:t>Разница AUROC составила плюс 0,038. При тысяче bootstrap-повторов на уровне фактов 95-процентный интервал разницы составил от плюс 0,001 до плюс 0,084. Интервал не пересекает ноль. Это поддерживает гипотезу о том, что траектория согласованности содержит дополнительный сигнал.</w:t>
+        <w:t>Обычный способ смотрит только на пять готовых ответов в конце. Его результат составил 0,842.</w:t>
+      </w:r>
+    </w:p>
+    <w:p>
+      <w:pPr>
+        <w:jc w:val="both"/>
+      </w:pPr>
+      <w:r>
+        <w:t>Мой способ дополнительно смотрит, как ответы менялись шаг за шагом. Его результат составил 0,879.</w:t>
+      </w:r>
+    </w:p>
+    <w:p>
+      <w:pPr>
+        <w:jc w:val="both"/>
+      </w:pPr>
+      <w:r>
+        <w:t>Здесь используется показатель AUROC. Если объяснить просто, 0,5 означает почти случайное угадывание, а 1 означает идеальное разделение правильных и ошибочных ответов. Поэтому 0,879 — хороший результат для пилотного исследования.</w:t>
+      </w:r>
+    </w:p>
+    <w:p>
+      <w:pPr>
+        <w:jc w:val="both"/>
+      </w:pPr>
+      <w:r>
+        <w:t>Мой способ улучшил результат на 0,038. Дополнительная статистическая проверка показала, что это улучшение не похоже на случайность.</w:t>
+      </w:r>
+    </w:p>
+    <w:p>
+      <w:pPr>
+        <w:jc w:val="both"/>
+      </w:pPr>
+      <w:r>
+        <w:t>Таким образом, моя гипотеза получила поддержку: важно смотреть не только на финальные ответы, но и на то, как они меняются.</w:t>
       </w:r>
     </w:p>
     <w:p>
@@ -228,7 +300,23 @@
         <w:jc w:val="both"/>
       </w:pPr>
       <w:r>
-        <w:t>Практический смысл проекта — не заменить проверку фактов, а определить её приоритет. Система может присвоить ответу оценку риска. Ответы с высоким риском направляются человеку или внешнему источнику на дополнительную проверку, а остальные не требуют одинакового объёма внимания.</w:t>
+        <w:t>Как это можно использовать на практике?</w:t>
+      </w:r>
+    </w:p>
+    <w:p>
+      <w:pPr>
+        <w:jc w:val="both"/>
+      </w:pPr>
+      <w:r>
+        <w:t>Программа присваивает ответу уровень риска. Если риск высокий, ответ можно отправить учителю, эксперту или другой системе на дополнительную проверку.</w:t>
+      </w:r>
+    </w:p>
+    <w:p>
+      <w:pPr>
+        <w:jc w:val="both"/>
+      </w:pPr>
+      <w:r>
+        <w:t>Этот метод не заменяет человека. Он помогает выбрать ответы, которые нужно проверить в первую очередь.</w:t>
       </w:r>
     </w:p>
     <w:p>
@@ -250,7 +338,7 @@
         <w:jc w:val="both"/>
       </w:pPr>
       <w:r>
-        <w:t>У исследования есть ограничения. Это pilot на 100 фактах, а recall при выбранном пороге равен 0,333, поэтому система пока обнаруживает не все ошибки. Кроме того, группировку смыслов выполнял LLM-as-a-judge. Для независимой проверки уже подготовлена слепая стратифицированная выборка из 200 случаев, и я не заявляю эту проверку как завершённую.</w:t>
+        <w:t>У проекта есть ограничения. Пока использовано только 100 фактов. Кроме того, система находит не все ошибки. Поэтому следующим шагом должно стать увеличение количества вопросов и дополнительная проверка смысловых групп человеком.</w:t>
       </w:r>
     </w:p>
     <w:p>
@@ -258,7 +346,23 @@
         <w:jc w:val="both"/>
       </w:pPr>
       <w:r>
-        <w:t>Итоговый вывод: динамика повторных ответов действительно помогает прогнозировать фактические ошибки лучше одной финальной оценки согласованности. Проект полностью воспроизводим: опубликованы код, конфигурации, benchmark, модели, результаты и инструкция локального запуска. Спасибо за внимание. Я готов ответить на вопросы.</w:t>
+        <w:t>Главный вывод моей работы: если языковая модель несколько раз меняет смысл ответа, это действительно помогает заметить повышенный риск фактической ошибки.</w:t>
+      </w:r>
+    </w:p>
+    <w:p>
+      <w:pPr>
+        <w:jc w:val="both"/>
+      </w:pPr>
+      <w:r>
+        <w:t>Код, данные, результаты и инструкция запуска опубликованы в GitHub. Проект можно проверить и повторить на другом компьютере.</w:t>
+      </w:r>
+    </w:p>
+    <w:p>
+      <w:pPr>
+        <w:jc w:val="both"/>
+      </w:pPr>
+      <w:r>
+        <w:t>Спасибо за внимание. Я готов ответить на вопросы.</w:t>
       </w:r>
     </w:p>
     <w:p>
@@ -271,7 +375,7 @@
           <w:b/>
           <w:sz w:val="30"/>
         </w:rPr>
-        <w:t>Аварийная версия — около 60 секунд</w:t>
+        <w:t>Если попросят объяснить проект одним предложением</w:t>
       </w:r>
     </w:p>
     <w:p>
@@ -279,7 +383,20 @@
         <w:jc w:val="both"/>
       </w:pPr>
       <w:r>
-        <w:t>Здравствуйте. Меня зовут Саурыков Ихсан, 12D класс. Мой проект проверяет, можно ли прогнозировать фактические ошибки языковой модели по изменению смысла её повторных ответов.</w:t>
+        <w:t>Я несколько раз задаю искусственному интеллекту один вопрос и по изменению его ответов оцениваю риск того, что первый ответ был неправильным.</w:t>
+      </w:r>
+    </w:p>
+    <w:p>
+      <w:pPr>
+        <w:spacing w:before="240"/>
+      </w:pPr>
+      <w:r>
+        <w:rPr>
+          <w:rFonts w:ascii="Arial" w:hAnsi="Arial"/>
+          <w:b/>
+          <w:sz w:val="30"/>
+        </w:rPr>
+        <w:t>Простые ответы на возможные вопросы</w:t>
       </w:r>
     </w:p>
     <w:p>
@@ -287,7 +404,7 @@
         <w:jc w:val="both"/>
       </w:pPr>
       <w:r>
-        <w:t>Я подготовил 100 проверенных фактов на английском, русском и казахском языках и собрал 5 400 ответов трёх моделей Groq. Для каждого случая использовался один основной ответ и пять повторных генераций. По префиксам от двух до пяти ответов я вычислял семантическую энтропию, число смысловых групп и поддержку основного ответа.</w:t>
+        <w:t>Что нового в проекте?</w:t>
       </w:r>
     </w:p>
     <w:p>
@@ -295,7 +412,7 @@
         <w:jc w:val="both"/>
       </w:pPr>
       <w:r>
-        <w:t>На заранее закрытом тесте из 131 случая динамическая модель получила AUROC 0,879, а статическая модель только с финальными признаками — 0,842. Разница составила плюс 0,038, а её 95-процентный bootstrap-интервал не пересёк ноль. Значит, траектория согласованности действительно добавляет полезный сигнал.</w:t>
+        <w:t>Я смотрю не только на итоговое различие ответов, но и на то, как ответы меняются после каждой новой попытки.</w:t>
       </w:r>
     </w:p>
     <w:p>
@@ -303,7 +420,132 @@
         <w:jc w:val="both"/>
       </w:pPr>
       <w:r>
-        <w:t>Практически этот метод может направлять наиболее рискованные ответы на дополнительную проверку. Ограничения проекта — pilot из 100 фактов, recall 0,333 и необходимость независимой человеческой проверки semantic judge. Код, данные и результаты опубликованы для воспроизводимости. Спасибо.</w:t>
+        <w:t>Что такое AUROC?</w:t>
+      </w:r>
+    </w:p>
+    <w:p>
+      <w:pPr>
+        <w:jc w:val="both"/>
+      </w:pPr>
+      <w:r>
+        <w:t>Это оценка того, насколько хорошо система отделяет рискованные ответы от надёжных. 0,5 — случайный результат, 1 — идеальный.</w:t>
+      </w:r>
+    </w:p>
+    <w:p>
+      <w:pPr>
+        <w:jc w:val="both"/>
+      </w:pPr>
+      <w:r>
+        <w:t>Зачем задавать вопрос пять раз?</w:t>
+      </w:r>
+    </w:p>
+    <w:p>
+      <w:pPr>
+        <w:jc w:val="both"/>
+      </w:pPr>
+      <w:r>
+        <w:t>Чтобы увидеть, сохраняет ли модель один ответ или начинает давать разные версии.</w:t>
+      </w:r>
+    </w:p>
+    <w:p>
+      <w:pPr>
+        <w:jc w:val="both"/>
+      </w:pPr>
+      <w:r>
+        <w:t>Почему это не обычная проверка фактов?</w:t>
+      </w:r>
+    </w:p>
+    <w:p>
+      <w:pPr>
+        <w:jc w:val="both"/>
+      </w:pPr>
+      <w:r>
+        <w:t>Метод сначала показывает, какие ответы наиболее подозрительны. После этого человек или источник проверяет сам факт.</w:t>
+      </w:r>
+    </w:p>
+    <w:p>
+      <w:pPr>
+        <w:jc w:val="both"/>
+      </w:pPr>
+      <w:r>
+        <w:t>Какой главный результат?</w:t>
+      </w:r>
+    </w:p>
+    <w:p>
+      <w:pPr>
+        <w:jc w:val="both"/>
+      </w:pPr>
+      <w:r>
+        <w:t>Способ с изменением ответов получил 0,879, а способ только с финальными ответами — 0,842.</w:t>
+      </w:r>
+    </w:p>
+    <w:p>
+      <w:pPr>
+        <w:jc w:val="both"/>
+      </w:pPr>
+      <w:r>
+        <w:t>Какое главное ограничение?</w:t>
+      </w:r>
+    </w:p>
+    <w:p>
+      <w:pPr>
+        <w:jc w:val="both"/>
+      </w:pPr>
+      <w:r>
+        <w:t>Это пилот на 100 фактах, поэтому для окончательного вывода нужны более крупные данные.</w:t>
+      </w:r>
+    </w:p>
+    <w:p>
+      <w:pPr>
+        <w:spacing w:before="240"/>
+      </w:pPr>
+      <w:r>
+        <w:rPr>
+          <w:rFonts w:ascii="Arial" w:hAnsi="Arial"/>
+          <w:b/>
+          <w:sz w:val="30"/>
+        </w:rPr>
+        <w:t>Короткая версия — около 60 секунд</w:t>
+      </w:r>
+    </w:p>
+    <w:p>
+      <w:pPr>
+        <w:jc w:val="both"/>
+      </w:pPr>
+      <w:r>
+        <w:t>Здравствуйте. Меня зовут Саурыков Ихсан, я учусь в 12D классе.</w:t>
+      </w:r>
+    </w:p>
+    <w:p>
+      <w:pPr>
+        <w:jc w:val="both"/>
+      </w:pPr>
+      <w:r>
+        <w:t>Искусственный интеллект иногда отвечает уверенно, но неправильно. Я проверил, можно ли заметить такую ошибку по повторным ответам модели.</w:t>
+      </w:r>
+    </w:p>
+    <w:p>
+      <w:pPr>
+        <w:jc w:val="both"/>
+      </w:pPr>
+      <w:r>
+        <w:t>Я подготовил 100 проверенных фактов на английском, русском и казахском языках. Три модели отвечали на каждый вопрос по шесть раз. Всего было собрано 5 400 ответов.</w:t>
+      </w:r>
+    </w:p>
+    <w:p>
+      <w:pPr>
+        <w:jc w:val="both"/>
+      </w:pPr>
+      <w:r>
+        <w:t>Программа смотрела, сохраняет ли модель один смысл или начинает давать разные версии. Способ, который учитывал изменение ответов, получил результат 0,879. Обычный способ, который смотрел только на финальные ответы, получил 0,842.</w:t>
+      </w:r>
+    </w:p>
+    <w:p>
+      <w:pPr>
+        <w:jc w:val="both"/>
+      </w:pPr>
+      <w:r>
+        <w:t>Значит, изменение повторных ответов действительно помогает находить риск фактической ошибки. Такой метод может показывать, какие ответы нужно проверить в первую очередь. Спасибо.</w:t>
       </w:r>
     </w:p>
     <w:sectPr>

</xml_diff>

<commit_message>
docs: refine defense pitch tone
</commit_message>
<xml_diff>
--- a/deliverables/RKNP/RKNP_речь_5_минут.docx
+++ b/deliverables/RKNP/RKNP_речь_5_минут.docx
@@ -13,7 +13,7 @@
           <w:b/>
           <w:sz w:val="40"/>
         </w:rPr>
-        <w:t>Простая речь к защите — 5 минут</w:t>
+        <w:t>Речь к защите проекта: 5 минут</w:t>
       </w:r>
     </w:p>
     <w:p>
@@ -48,7 +48,7 @@
         <w:jc w:val="both"/>
       </w:pPr>
       <w:r>
-        <w:t>Здравствуйте. Меня зовут Саурыков Ихсан, я учусь в 12D классе НИШ города Талдыкорган.</w:t>
+        <w:t>Здравствуйте, уважаемые члены комиссии. Меня зовут Саурыков Ихсан, я ученик 12D класса Назарбаевской Интеллектуальной Школы физико-математического направления города Талдыкорган.</w:t>
       </w:r>
     </w:p>
     <w:p>
@@ -56,7 +56,7 @@
         <w:jc w:val="both"/>
       </w:pPr>
       <w:r>
-        <w:t>Мой проект посвящён ошибкам искусственного интеллекта. Я исследовал, можно ли заранее понять, что ответ языковой модели может быть неправильным.</w:t>
+        <w:t>Тема моего проекта: прогнозирование фактических ошибок языковых моделей по динамике семантической согласованности повторных ответов.</w:t>
       </w:r>
     </w:p>
     <w:p>
@@ -78,7 +78,7 @@
         <w:jc w:val="both"/>
       </w:pPr>
       <w:r>
-        <w:t>Проблема в том, что искусственный интеллект иногда отвечает очень уверенно, но ошибается. Ответ может быть длинным, грамотным и убедительным. Поэтому человеку трудно сразу заметить ошибку.</w:t>
+        <w:t>Языковая модель может дать грамотный и уверенный ответ, который содержит фактическую ошибку. Пользователь видит готовый текст, но обычно не видит, насколько модель уверена в конкретном факте. Из-за этого ошибку сложно заметить без дополнительной проверки.</w:t>
       </w:r>
     </w:p>
     <w:p>
@@ -86,7 +86,7 @@
         <w:jc w:val="both"/>
       </w:pPr>
       <w:r>
-        <w:t>Это особенно важно, когда школьники используют искусственный интеллект для учёбы или поиска информации.</w:t>
+        <w:t>Я поставил задачу получить сигнал риска, используя только ответы модели через API, без доступа к её внутренним параметрам.</w:t>
       </w:r>
     </w:p>
     <w:p>
@@ -100,7 +100,7 @@
           <w:color w:val="2563EB"/>
           <w:sz w:val="22"/>
         </w:rPr>
-        <w:t>[Слайды 3–4]</w:t>
+        <w:t>[Слайды 3 и 4]</w:t>
       </w:r>
     </w:p>
     <w:p>
@@ -108,7 +108,7 @@
         <w:jc w:val="both"/>
       </w:pPr>
       <w:r>
-        <w:t>Моя идея была простой. Я задавал модели один и тот же вопрос несколько раз.</w:t>
+        <w:t>Моя гипотеза состоит в следующем: если несколько раз задать модели один вопрос и проследить, как меняется смысл ответов, можно оценить риск ошибки в первоначальном ответе.</w:t>
       </w:r>
     </w:p>
     <w:p>
@@ -116,15 +116,7 @@
         <w:jc w:val="both"/>
       </w:pPr>
       <w:r>
-        <w:t>Если модель каждый раз говорит примерно одно и то же, её ответы стабильны. Если она начинает давать разные версии, это может означать, что она не уверена и риск ошибки выше.</w:t>
-      </w:r>
-    </w:p>
-    <w:p>
-      <w:pPr>
-        <w:jc w:val="both"/>
-      </w:pPr>
-      <w:r>
-        <w:t>Поэтому мой главный вопрос звучал так: можно ли использовать изменения повторных ответов, чтобы находить возможные ошибки?</w:t>
+        <w:t>Когда повторные ответы поддерживают одну версию, модель показывает высокую смысловую согласованность. Когда появляются разные версии, согласованность снижается. При этом важен весь путь изменений после второго, третьего, четвёртого и пятого ответа. Этот путь я называю динамикой семантической согласованности.</w:t>
       </w:r>
     </w:p>
     <w:p>
@@ -138,7 +130,7 @@
           <w:color w:val="2563EB"/>
           <w:sz w:val="22"/>
         </w:rPr>
-        <w:t>[Слайды 5–7]</w:t>
+        <w:t>[Слайды 5, 6 и 7]</w:t>
       </w:r>
     </w:p>
     <w:p>
@@ -146,7 +138,7 @@
         <w:jc w:val="both"/>
       </w:pPr>
       <w:r>
-        <w:t>Для эксперимента я подготовил 100 фактов из истории, географии, науки, культуры и Казахстана. Также были вопросы с неправильной предпосылкой. Например, вопрос мог спрашивать о событии, которого на самом деле не было.</w:t>
+        <w:t>Для эксперимента я подготовил benchmark из 100 проверенных фактов. В него вошли вопросы по истории, географии, науке, культуре и Казахстану, а также вопросы с ложной предпосылкой.</w:t>
       </w:r>
     </w:p>
     <w:p>
@@ -154,7 +146,7 @@
         <w:jc w:val="both"/>
       </w:pPr>
       <w:r>
-        <w:t>Каждый вопрос был записан на трёх языках: английском, русском и казахском. У каждого вопроса был правильный ответ и надёжный источник. Все факты были заранее проверены человеком.</w:t>
+        <w:t>Каждый вопрос представлен на английском, русском и казахском языках. Для него указан эталонный ответ, допустимые варианты написания и надёжный источник. Все факты и переводы были проверены человеком до начала эксперимента.</w:t>
       </w:r>
     </w:p>
     <w:p>
@@ -162,7 +154,7 @@
         <w:jc w:val="both"/>
       </w:pPr>
       <w:r>
-        <w:t>Я использовал три языковые модели. Для каждого вопроса модель давала один основной ответ и ещё пять повторных ответов. Всего было собрано 5 400 ответов.</w:t>
+        <w:t>Я использовал три модели, доступные через Groq API. Для каждой комбинации вопроса, языка и модели собирался один основной ответ и пять повторных ответов. Всего получено 5 400 ответов.</w:t>
       </w:r>
     </w:p>
     <w:p>
@@ -170,7 +162,15 @@
         <w:jc w:val="both"/>
       </w:pPr>
       <w:r>
-        <w:t>Основной ответ проверялся полностью. Если правильное слово было указано, но рядом модель добавляла неправильный факт, такой ответ считался ошибочным.</w:t>
+        <w:t>Основной ответ оценивался целиком. Если модель называла правильный факт, но добавляла ошибочное пояснение, ответ считался неверным. Оборванные ответы отмечались отдельно.</w:t>
+      </w:r>
+    </w:p>
+    <w:p>
+      <w:pPr>
+        <w:jc w:val="both"/>
+      </w:pPr>
+      <w:r>
+        <w:t>Данные были разделены на обучающую, проверочную и тестовую части в пропорции 70, 15 и 15 процентов. Разделение проводилось на уровне фактов. Поэтому один и тот же факт не попадал одновременно в обучение и тест.</w:t>
       </w:r>
     </w:p>
     <w:p>
@@ -184,7 +184,7 @@
           <w:color w:val="2563EB"/>
           <w:sz w:val="22"/>
         </w:rPr>
-        <w:t>[Слайды 8–10]</w:t>
+        <w:t>[Слайды 8, 9 и 10]</w:t>
       </w:r>
     </w:p>
     <w:p>
@@ -192,7 +192,7 @@
         <w:jc w:val="both"/>
       </w:pPr>
       <w:r>
-        <w:t>После этого программа сравнивала смысл пяти повторных ответов.</w:t>
+        <w:t>Для повторных ответов программа определяла смысловые группы и рассчитывала признаки. Среди них были число разных версий, поддержка первоначального ответа и семантическая энтропия. Семантическая энтропия показывает, насколько сильно ответы расходятся по смыслу.</w:t>
       </w:r>
     </w:p>
     <w:p>
@@ -200,7 +200,7 @@
         <w:jc w:val="both"/>
       </w:pPr>
       <w:r>
-        <w:t>Она проверяла три вещи. Насколько ответы похожи друг на друга. Сколько разных версий ответа появилось. И поддерживают ли повторные ответы первоначальный ответ модели.</w:t>
+        <w:t>Эти показатели рассчитывались после двух, трёх, четырёх и пяти генераций. Затем я сравнил два подхода. Статический подход использовал только итоговое состояние после пятого ответа. Динамический подход учитывал, как показатели изменялись на каждом шаге.</w:t>
       </w:r>
     </w:p>
     <w:p>
@@ -208,15 +208,7 @@
         <w:jc w:val="both"/>
       </w:pPr>
       <w:r>
-        <w:t>Я также смотрел, как эти показатели менялись после второго, третьего, четвёртого и пятого ответа. Именно это я называю динамикой ответов.</w:t>
-      </w:r>
-    </w:p>
-    <w:p>
-      <w:pPr>
-        <w:jc w:val="both"/>
-      </w:pPr>
-      <w:r>
-        <w:t>Для итогового анализа подошли 832 случая. Данные были разделены на обучение, настройку и финальную проверку. Вопросы из финальной проверки не использовались при обучении модели.</w:t>
+        <w:t>Полный набор генераций имели 866 случаев. После исключения неопределённых результатов смысловой группировки в анализ вошли 832 случая.</w:t>
       </w:r>
     </w:p>
     <w:p>
@@ -230,7 +222,7 @@
           <w:color w:val="2563EB"/>
           <w:sz w:val="22"/>
         </w:rPr>
-        <w:t>[Слайды 11–12]</w:t>
+        <w:t>[Слайды 11 и 12]</w:t>
       </w:r>
     </w:p>
     <w:p>
@@ -238,7 +230,7 @@
         <w:jc w:val="both"/>
       </w:pPr>
       <w:r>
-        <w:t>Теперь главный результат.</w:t>
+        <w:t>На заранее закрытой тестовой выборке из 131 случая динамическая модель получила AUROC 0,879. Статическая модель получила 0,842.</w:t>
       </w:r>
     </w:p>
     <w:p>
@@ -246,7 +238,7 @@
         <w:jc w:val="both"/>
       </w:pPr>
       <w:r>
-        <w:t>Обычный способ смотрит только на пять готовых ответов в конце. Его результат составил 0,842.</w:t>
+        <w:t>AUROC показывает, насколько хорошо система ставит ошибочные ответы выше правильных по уровню риска. Значение 0,5 соответствует случайному ранжированию, а значение 1 соответствует идеальному результату.</w:t>
       </w:r>
     </w:p>
     <w:p>
@@ -254,31 +246,7 @@
         <w:jc w:val="both"/>
       </w:pPr>
       <w:r>
-        <w:t>Мой способ дополнительно смотрит, как ответы менялись шаг за шагом. Его результат составил 0,879.</w:t>
-      </w:r>
-    </w:p>
-    <w:p>
-      <w:pPr>
-        <w:jc w:val="both"/>
-      </w:pPr>
-      <w:r>
-        <w:t>Здесь используется показатель AUROC. Если объяснить просто, 0,5 означает почти случайное угадывание, а 1 означает идеальное разделение правильных и ошибочных ответов. Поэтому 0,879 — хороший результат для пилотного исследования.</w:t>
-      </w:r>
-    </w:p>
-    <w:p>
-      <w:pPr>
-        <w:jc w:val="both"/>
-      </w:pPr>
-      <w:r>
-        <w:t>Мой способ улучшил результат на 0,038. Дополнительная статистическая проверка показала, что это улучшение не похоже на случайность.</w:t>
-      </w:r>
-    </w:p>
-    <w:p>
-      <w:pPr>
-        <w:jc w:val="both"/>
-      </w:pPr>
-      <w:r>
-        <w:t>Таким образом, моя гипотеза получила поддержку: важно смотреть не только на финальные ответы, но и на то, как они меняются.</w:t>
+        <w:t>Преимущество динамического подхода составило 0,038. Я провёл тысячу bootstrap-повторов на уровне фактов. Доверительный интервал разницы составил от 0,001 до 0,084 и не включил ноль. Результат поддерживает мою гипотезу: изменение согласованности содержит дополнительный сигнал по сравнению с одной финальной оценкой.</w:t>
       </w:r>
     </w:p>
     <w:p>
@@ -300,23 +268,7 @@
         <w:jc w:val="both"/>
       </w:pPr>
       <w:r>
-        <w:t>Как это можно использовать на практике?</w:t>
-      </w:r>
-    </w:p>
-    <w:p>
-      <w:pPr>
-        <w:jc w:val="both"/>
-      </w:pPr>
-      <w:r>
-        <w:t>Программа присваивает ответу уровень риска. Если риск высокий, ответ можно отправить учителю, эксперту или другой системе на дополнительную проверку.</w:t>
-      </w:r>
-    </w:p>
-    <w:p>
-      <w:pPr>
-        <w:jc w:val="both"/>
-      </w:pPr>
-      <w:r>
-        <w:t>Этот метод не заменяет человека. Он помогает выбрать ответы, которые нужно проверить в первую очередь.</w:t>
+        <w:t>Практическое применение проекта состоит в приоритизации проверки. Система присваивает каждому ответу оценку риска. Ответы с высоким риском можно направить человеку или внешнему источнику для проверки в первую очередь. Такой подход сокращает объём ручной работы, когда ответов много.</w:t>
       </w:r>
     </w:p>
     <w:p>
@@ -330,7 +282,7 @@
           <w:color w:val="2563EB"/>
           <w:sz w:val="22"/>
         </w:rPr>
-        <w:t>[Слайды 14–15]</w:t>
+        <w:t>[Слайды 14 и 15]</w:t>
       </w:r>
     </w:p>
     <w:p>
@@ -338,7 +290,7 @@
         <w:jc w:val="both"/>
       </w:pPr>
       <w:r>
-        <w:t>У проекта есть ограничения. Пока использовано только 100 фактов. Кроме того, система находит не все ошибки. Поэтому следующим шагом должно стать увеличение количества вопросов и дополнительная проверка смысловых групп человеком.</w:t>
+        <w:t>У исследования есть ограничения. Это пилотный эксперимент на 100 фактах. При выбранном пороге модель обнаруживает около одной трети фактических ошибок, поэтому её пока нельзя использовать как единственный способ контроля. Смысловые группы также требуют независимой человеческой проверки. Для неё подготовлена слепая выборка из 200 случаев.</w:t>
       </w:r>
     </w:p>
     <w:p>
@@ -346,7 +298,7 @@
         <w:jc w:val="both"/>
       </w:pPr>
       <w:r>
-        <w:t>Главный вывод моей работы: если языковая модель несколько раз меняет смысл ответа, это действительно помогает заметить повышенный риск фактической ошибки.</w:t>
+        <w:t>Я делаю следующий вывод: динамика повторных ответов помогает оценивать риск фактической ошибки лучше, чем итоговая согласованность сама по себе. Код, данные, настройки эксперимента и результаты опубликованы в GitHub, поэтому работу можно воспроизвести на другом компьютере.</w:t>
       </w:r>
     </w:p>
     <w:p>
@@ -354,15 +306,7 @@
         <w:jc w:val="both"/>
       </w:pPr>
       <w:r>
-        <w:t>Код, данные, результаты и инструкция запуска опубликованы в GitHub. Проект можно проверить и повторить на другом компьютере.</w:t>
-      </w:r>
-    </w:p>
-    <w:p>
-      <w:pPr>
-        <w:jc w:val="both"/>
-      </w:pPr>
-      <w:r>
-        <w:t>Спасибо за внимание. Я готов ответить на вопросы.</w:t>
+        <w:t>Спасибо за внимание. Я готов ответить на ваши вопросы.</w:t>
       </w:r>
     </w:p>
     <w:p>
@@ -375,7 +319,7 @@
           <w:b/>
           <w:sz w:val="30"/>
         </w:rPr>
-        <w:t>Если попросят объяснить проект одним предложением</w:t>
+        <w:t>Краткое объяснение проекта</w:t>
       </w:r>
     </w:p>
     <w:p>
@@ -383,7 +327,7 @@
         <w:jc w:val="both"/>
       </w:pPr>
       <w:r>
-        <w:t>Я несколько раз задаю искусственному интеллекту один вопрос и по изменению его ответов оцениваю риск того, что первый ответ был неправильным.</w:t>
+        <w:t>Я задаю языковой модели один вопрос несколько раз и анализирую, как меняется смысл её ответов. Чем менее стабильны ответы, тем выше предполагаемый риск ошибки в первоначальном ответе.</w:t>
       </w:r>
     </w:p>
     <w:p>
@@ -396,7 +340,7 @@
           <w:b/>
           <w:sz w:val="30"/>
         </w:rPr>
-        <w:t>Простые ответы на возможные вопросы</w:t>
+        <w:t>Ответы на вопросы комиссии</w:t>
       </w:r>
     </w:p>
     <w:p>
@@ -404,7 +348,7 @@
         <w:jc w:val="both"/>
       </w:pPr>
       <w:r>
-        <w:t>Что нового в проекте?</w:t>
+        <w:t>В чём научная новизна работы?</w:t>
       </w:r>
     </w:p>
     <w:p>
@@ -412,7 +356,7 @@
         <w:jc w:val="both"/>
       </w:pPr>
       <w:r>
-        <w:t>Я смотрю не только на итоговое различие ответов, но и на то, как ответы меняются после каждой новой попытки.</w:t>
+        <w:t>Я использую траекторию признаков после каждой новой генерации. Статический подход видит только итог после пяти ответов, а мой подход учитывает процесс изменения согласованности.</w:t>
       </w:r>
     </w:p>
     <w:p>
@@ -420,7 +364,7 @@
         <w:jc w:val="both"/>
       </w:pPr>
       <w:r>
-        <w:t>Что такое AUROC?</w:t>
+        <w:t>Что такое семантическая согласованность?</w:t>
       </w:r>
     </w:p>
     <w:p>
@@ -428,7 +372,7 @@
         <w:jc w:val="both"/>
       </w:pPr>
       <w:r>
-        <w:t>Это оценка того, насколько хорошо система отделяет рискованные ответы от надёжных. 0,5 — случайный результат, 1 — идеальный.</w:t>
+        <w:t>Это степень совпадения ответов по смыслу. Разные формулировки считаются согласованными, если они сообщают один и тот же факт.</w:t>
       </w:r>
     </w:p>
     <w:p>
@@ -436,7 +380,7 @@
         <w:jc w:val="both"/>
       </w:pPr>
       <w:r>
-        <w:t>Зачем задавать вопрос пять раз?</w:t>
+        <w:t>Что такое семантическая энтропия?</w:t>
       </w:r>
     </w:p>
     <w:p>
@@ -444,7 +388,7 @@
         <w:jc w:val="both"/>
       </w:pPr>
       <w:r>
-        <w:t>Чтобы увидеть, сохраняет ли модель один ответ или начинает давать разные версии.</w:t>
+        <w:t>Это численная мера смыслового разброса. Она растёт, когда ответы распределяются между несколькими разными версиями.</w:t>
       </w:r>
     </w:p>
     <w:p>
@@ -452,7 +396,7 @@
         <w:jc w:val="both"/>
       </w:pPr>
       <w:r>
-        <w:t>Почему это не обычная проверка фактов?</w:t>
+        <w:t>Что означает AUROC 0,879?</w:t>
       </w:r>
     </w:p>
     <w:p>
@@ -460,7 +404,7 @@
         <w:jc w:val="both"/>
       </w:pPr>
       <w:r>
-        <w:t>Метод сначала показывает, какие ответы наиболее подозрительны. После этого человек или источник проверяет сам факт.</w:t>
+        <w:t>Показатель оценивает качество ранжирования по риску. Чем он ближе к единице, тем чаще ошибочный ответ получает больший риск, чем правильный.</w:t>
       </w:r>
     </w:p>
     <w:p>
@@ -468,7 +412,7 @@
         <w:jc w:val="both"/>
       </w:pPr>
       <w:r>
-        <w:t>Какой главный результат?</w:t>
+        <w:t>Почему использовано пять повторных ответов?</w:t>
       </w:r>
     </w:p>
     <w:p>
@@ -476,7 +420,7 @@
         <w:jc w:val="both"/>
       </w:pPr>
       <w:r>
-        <w:t>Способ с изменением ответов получил 0,879, а способ только с финальными ответами — 0,842.</w:t>
+        <w:t>Пять ответов дают возможность проследить несколько шагов изменения и при этом сохраняют приемлемую стоимость эксперимента.</w:t>
       </w:r>
     </w:p>
     <w:p>
@@ -484,7 +428,7 @@
         <w:jc w:val="both"/>
       </w:pPr>
       <w:r>
-        <w:t>Какое главное ограничение?</w:t>
+        <w:t>Можно ли считать гипотезу доказанной?</w:t>
       </w:r>
     </w:p>
     <w:p>
@@ -492,7 +436,23 @@
         <w:jc w:val="both"/>
       </w:pPr>
       <w:r>
-        <w:t>Это пилот на 100 фактах, поэтому для окончательного вывода нужны более крупные данные.</w:t>
+        <w:t>Результаты пилотного эксперимента поддерживают гипотезу. Для более общего вывода потребуется увеличить benchmark и провести независимую человеческую проверку смысловых групп.</w:t>
+      </w:r>
+    </w:p>
+    <w:p>
+      <w:pPr>
+        <w:jc w:val="both"/>
+      </w:pPr>
+      <w:r>
+        <w:t>Какое главное ограничение модели?</w:t>
+      </w:r>
+    </w:p>
+    <w:p>
+      <w:pPr>
+        <w:jc w:val="both"/>
+      </w:pPr>
+      <w:r>
+        <w:t>При выбранном пороге она обнаруживает около трети ошибок. Сейчас её следует использовать для определения приоритета проверки, а не для окончательного решения.</w:t>
       </w:r>
     </w:p>
     <w:p>
@@ -505,7 +465,7 @@
           <w:b/>
           <w:sz w:val="30"/>
         </w:rPr>
-        <w:t>Короткая версия — около 60 секунд</w:t>
+        <w:t>Короткая версия: около 60 секунд</w:t>
       </w:r>
     </w:p>
     <w:p>
@@ -513,7 +473,7 @@
         <w:jc w:val="both"/>
       </w:pPr>
       <w:r>
-        <w:t>Здравствуйте. Меня зовут Саурыков Ихсан, я учусь в 12D классе.</w:t>
+        <w:t>Здравствуйте. Меня зовут Саурыков Ихсан, я ученик 12D класса. Я исследовал, можно ли прогнозировать фактические ошибки языковой модели по изменению её повторных ответов.</w:t>
       </w:r>
     </w:p>
     <w:p>
@@ -521,7 +481,7 @@
         <w:jc w:val="both"/>
       </w:pPr>
       <w:r>
-        <w:t>Искусственный интеллект иногда отвечает уверенно, но неправильно. Я проверил, можно ли заметить такую ошибку по повторным ответам модели.</w:t>
+        <w:t>Для эксперимента я подготовил 100 проверенных фактов на английском, русском и казахском языках. Три модели отвечали на каждый вопрос шесть раз. Всего было собрано 5 400 ответов.</w:t>
       </w:r>
     </w:p>
     <w:p>
@@ -529,7 +489,7 @@
         <w:jc w:val="both"/>
       </w:pPr>
       <w:r>
-        <w:t>Я подготовил 100 проверенных фактов на английском, русском и казахском языках. Три модели отвечали на каждый вопрос по шесть раз. Всего было собрано 5 400 ответов.</w:t>
+        <w:t>Программа измеряла, насколько ответы совпадают по смыслу и как эта согласованность меняется после каждой генерации. На закрытом тесте динамический подход получил AUROC 0,879, а статический подход с одной итоговой оценкой получил 0,842. Статистическая проверка поддержала преимущество динамического подхода.</w:t>
       </w:r>
     </w:p>
     <w:p>
@@ -537,15 +497,7 @@
         <w:jc w:val="both"/>
       </w:pPr>
       <w:r>
-        <w:t>Программа смотрела, сохраняет ли модель один смысл или начинает давать разные версии. Способ, который учитывал изменение ответов, получил результат 0,879. Обычный способ, который смотрел только на финальные ответы, получил 0,842.</w:t>
-      </w:r>
-    </w:p>
-    <w:p>
-      <w:pPr>
-        <w:jc w:val="both"/>
-      </w:pPr>
-      <w:r>
-        <w:t>Значит, изменение повторных ответов действительно помогает находить риск фактической ошибки. Такой метод может показывать, какие ответы нужно проверить в первую очередь. Спасибо.</w:t>
+        <w:t>Полученный сигнал риска можно использовать, чтобы направлять наиболее подозрительные ответы на дополнительную проверку. Проект является пилотным, поэтому следующим этапом станет расширение benchmark и независимая проверка смысловой разметки. Спасибо за внимание.</w:t>
       </w:r>
     </w:p>
     <w:sectPr>

</xml_diff>

<commit_message>
fix(slides): align charts and defense speech
</commit_message>
<xml_diff>
--- a/deliverables/RKNP/RKNP_речь_5_минут.docx
+++ b/deliverables/RKNP/RKNP_речь_5_минут.docx
@@ -13,7 +13,7 @@
           <w:b/>
           <w:sz w:val="40"/>
         </w:rPr>
-        <w:t>Речь к защите проекта: 5 минут</w:t>
+        <w:t>Речь к презентации: 5 минут</w:t>
       </w:r>
     </w:p>
     <w:p>
@@ -48,7 +48,7 @@
         <w:jc w:val="both"/>
       </w:pPr>
       <w:r>
-        <w:t>Здравствуйте, уважаемые члены комиссии. Меня зовут Саурыков Ихсан, я ученик 12D класса Назарбаевской Интеллектуальной Школы физико-математического направления города Талдыкорган.</w:t>
+        <w:t>Здравствуйте, уважаемые члены комиссии. Меня зовут Саурыков Ихсан, я ученик 12D класса НИШ физико-математического направления города Талдыкорган.</w:t>
       </w:r>
     </w:p>
     <w:p>
@@ -56,7 +56,7 @@
         <w:jc w:val="both"/>
       </w:pPr>
       <w:r>
-        <w:t>Тема моего проекта: прогнозирование фактических ошибок языковых моделей по динамике семантической согласованности повторных ответов.</w:t>
+        <w:t>В своём проекте я исследовал, можно ли прогнозировать фактические ошибки искусственного интеллекта по изменению его повторных ответов.</w:t>
       </w:r>
     </w:p>
     <w:p>
@@ -78,7 +78,7 @@
         <w:jc w:val="both"/>
       </w:pPr>
       <w:r>
-        <w:t>Языковая модель может дать грамотный и уверенный ответ, который содержит фактическую ошибку. Пользователь видит готовый текст, но обычно не видит, насколько модель уверена в конкретном факте. Из-за этого ошибку сложно заметить без дополнительной проверки.</w:t>
+        <w:t>Проблема показана на примере. Модель уверенно ответила Apollo 11, хотя правильным ответом был Apollo 8. При этом ответ выглядел убедительно.</w:t>
       </w:r>
     </w:p>
     <w:p>
@@ -86,7 +86,7 @@
         <w:jc w:val="both"/>
       </w:pPr>
       <w:r>
-        <w:t>Я поставил задачу получить сигнал риска, используя только ответы модели через API, без доступа к её внутренним параметрам.</w:t>
+        <w:t>В работе я оценивал весь ответ целиком. Если модель называла правильный факт, но добавляла неправильную дату или ложное пояснение, ответ считался ошибочным.</w:t>
       </w:r>
     </w:p>
     <w:p>
@@ -100,7 +100,7 @@
           <w:color w:val="2563EB"/>
           <w:sz w:val="22"/>
         </w:rPr>
-        <w:t>[Слайды 3 и 4]</w:t>
+        <w:t>[Слайд 3]</w:t>
       </w:r>
     </w:p>
     <w:p>
@@ -108,7 +108,7 @@
         <w:jc w:val="both"/>
       </w:pPr>
       <w:r>
-        <w:t>Моя гипотеза состоит в следующем: если несколько раз задать модели один вопрос и проследить, как меняется смысл ответов, можно оценить риск ошибки в первоначальном ответе.</w:t>
+        <w:t>Исследовательский вопрос звучит так: можно ли заметить риск ошибки до проверки по внешнему источнику?</w:t>
       </w:r>
     </w:p>
     <w:p>
@@ -116,7 +116,7 @@
         <w:jc w:val="both"/>
       </w:pPr>
       <w:r>
-        <w:t>Когда повторные ответы поддерживают одну версию, модель показывает высокую смысловую согласованность. Когда появляются разные версии, согласованность снижается. При этом важен весь путь изменений после второго, третьего, четвёртого и пятого ответа. Этот путь я называю динамикой семантической согласованности.</w:t>
+        <w:t>Моя гипотеза: если повторные ответы модели начинают расходиться по смыслу, риск фактической ошибки повышается. Я сравнил динамический подход с сильной статической моделью на заранее закрытом тесте.</w:t>
       </w:r>
     </w:p>
     <w:p>
@@ -130,7 +130,7 @@
           <w:color w:val="2563EB"/>
           <w:sz w:val="22"/>
         </w:rPr>
-        <w:t>[Слайды 5, 6 и 7]</w:t>
+        <w:t>[Слайд 4]</w:t>
       </w:r>
     </w:p>
     <w:p>
@@ -138,7 +138,7 @@
         <w:jc w:val="both"/>
       </w:pPr>
       <w:r>
-        <w:t>Для эксперимента я подготовил benchmark из 100 проверенных фактов. В него вошли вопросы по истории, географии, науке, культуре и Казахстану, а также вопросы с ложной предпосылкой.</w:t>
+        <w:t>Эксперимент включает 100 фактов, три языка, три модели и шесть ответов для каждого условия. Это один основной ответ и пять повторных генераций. Всего собрано 5 400 ответов.</w:t>
       </w:r>
     </w:p>
     <w:p>
@@ -146,31 +146,7 @@
         <w:jc w:val="both"/>
       </w:pPr>
       <w:r>
-        <w:t>Каждый вопрос представлен на английском, русском и казахском языках. Для него указан эталонный ответ, допустимые варианты написания и надёжный источник. Все факты и переводы были проверены человеком до начала эксперимента.</w:t>
-      </w:r>
-    </w:p>
-    <w:p>
-      <w:pPr>
-        <w:jc w:val="both"/>
-      </w:pPr>
-      <w:r>
-        <w:t>Я использовал три модели, доступные через Groq API. Для каждой комбинации вопроса, языка и модели собирался один основной ответ и пять повторных ответов. Всего получено 5 400 ответов.</w:t>
-      </w:r>
-    </w:p>
-    <w:p>
-      <w:pPr>
-        <w:jc w:val="both"/>
-      </w:pPr>
-      <w:r>
-        <w:t>Основной ответ оценивался целиком. Если модель называла правильный факт, но добавляла ошибочное пояснение, ответ считался неверным. Оборванные ответы отмечались отдельно.</w:t>
-      </w:r>
-    </w:p>
-    <w:p>
-      <w:pPr>
-        <w:jc w:val="both"/>
-      </w:pPr>
-      <w:r>
-        <w:t>Данные были разделены на обучающую, проверочную и тестовую части в пропорции 70, 15 и 15 процентов. Разделение проводилось на уровне фактов. Поэтому один и тот же факт не попадал одновременно в обучение и тест.</w:t>
+        <w:t>Такой дизайн позволяет отдельно наблюдать влияние языка, модели и типа вопроса.</w:t>
       </w:r>
     </w:p>
     <w:p>
@@ -184,7 +160,7 @@
           <w:color w:val="2563EB"/>
           <w:sz w:val="22"/>
         </w:rPr>
-        <w:t>[Слайды 8, 9 и 10]</w:t>
+        <w:t>[Слайд 5]</w:t>
       </w:r>
     </w:p>
     <w:p>
@@ -192,7 +168,7 @@
         <w:jc w:val="both"/>
       </w:pPr>
       <w:r>
-        <w:t>Для повторных ответов программа определяла смысловые группы и рассчитывала признаки. Среди них были число разных версий, поддержка первоначального ответа и семантическая энтропия. Семантическая энтропия показывает, насколько сильно ответы расходятся по смыслу.</w:t>
+        <w:t>Benchmark состоит из шести групп. По 16 фактов относятся к истории, географии, науке, культуре и Казахстану. Ещё 20 вопросов содержат ложную предпосылку.</w:t>
       </w:r>
     </w:p>
     <w:p>
@@ -200,15 +176,7 @@
         <w:jc w:val="both"/>
       </w:pPr>
       <w:r>
-        <w:t>Эти показатели рассчитывались после двух, трёх, четырёх и пяти генераций. Затем я сравнил два подхода. Статический подход использовал только итоговое состояние после пятого ответа. Динамический подход учитывал, как показатели изменялись на каждом шаге.</w:t>
-      </w:r>
-    </w:p>
-    <w:p>
-      <w:pPr>
-        <w:jc w:val="both"/>
-      </w:pPr>
-      <w:r>
-        <w:t>Полный набор генераций имели 866 случаев. После исключения неопределённых результатов смысловой группировки в анализ вошли 832 случая.</w:t>
+        <w:t>Каждый факт имеет английскую, русскую и казахскую формулировку, правильный ответ и надёжный источник. Все факты проверены человеком.</w:t>
       </w:r>
     </w:p>
     <w:p>
@@ -222,7 +190,7 @@
           <w:color w:val="2563EB"/>
           <w:sz w:val="22"/>
         </w:rPr>
-        <w:t>[Слайды 11 и 12]</w:t>
+        <w:t>[Слайд 6]</w:t>
       </w:r>
     </w:p>
     <w:p>
@@ -230,7 +198,7 @@
         <w:jc w:val="both"/>
       </w:pPr>
       <w:r>
-        <w:t>На заранее закрытой тестовой выборке из 131 случая динамическая модель получила AUROC 0,879. Статическая модель получила 0,842.</w:t>
+        <w:t>Здесь показан весь метод. Сначала модель даёт основной и пять повторных ответов. Основной ответ получает фактическую оценку. Повторные ответы объединяются в смысловые группы.</w:t>
       </w:r>
     </w:p>
     <w:p>
@@ -238,7 +206,7 @@
         <w:jc w:val="both"/>
       </w:pPr>
       <w:r>
-        <w:t>AUROC показывает, насколько хорошо система ставит ошибочные ответы выше правильных по уровню риска. Значение 0,5 соответствует случайному ранжированию, а значение 1 соответствует идеальному результату.</w:t>
+        <w:t>Например, ответы «Нил Армстронг» и «первым был Neil Armstrong» имеют разные слова, но один смысл.</w:t>
       </w:r>
     </w:p>
     <w:p>
@@ -246,7 +214,179 @@
         <w:jc w:val="both"/>
       </w:pPr>
       <w:r>
-        <w:t>Преимущество динамического подхода составило 0,038. Я провёл тысячу bootstrap-повторов на уровне фактов. Доверительный интервал разницы составил от 0,001 до 0,084 и не включил ноль. Результат поддерживает мою гипотезу: изменение согласованности содержит дополнительный сигнал по сравнению с одной финальной оценкой.</w:t>
+        <w:t>Программа рассчитывает число смысловых групп, поддержку основного ответа и семантическую энтропию. Энтропия показывает степень смыслового разброса. Эти признаки измеряются после двух, трёх, четырёх и пяти ответов. Затем классификатор выдаёт вероятность ошибки.</w:t>
+      </w:r>
+    </w:p>
+    <w:p>
+      <w:pPr>
+        <w:spacing w:before="160" w:after="60"/>
+      </w:pPr>
+      <w:r>
+        <w:rPr>
+          <w:rFonts w:ascii="Arial" w:hAnsi="Arial"/>
+          <w:b/>
+          <w:color w:val="2563EB"/>
+          <w:sz w:val="22"/>
+        </w:rPr>
+        <w:t>[Слайд 7]</w:t>
+      </w:r>
+    </w:p>
+    <w:p>
+      <w:pPr>
+        <w:jc w:val="both"/>
+      </w:pPr>
+      <w:r>
+        <w:t>Все 5 400 ответов были сохранены. Полный набор генераций имели 866 случаев. В сырых ответах было 48 обрывов или некорректных результатов. Дублированных ключей не было.</w:t>
+      </w:r>
+    </w:p>
+    <w:p>
+      <w:pPr>
+        <w:jc w:val="both"/>
+      </w:pPr>
+      <w:r>
+        <w:t>Для 889 основных ответов получены фактические метки. Из них 732 проверены человеком, а 157 совпали с эталоном автоматически. Ещё 11 оборванных основных ответов оставлены без оценки.</w:t>
+      </w:r>
+    </w:p>
+    <w:p>
+      <w:pPr>
+        <w:spacing w:before="160" w:after="60"/>
+      </w:pPr>
+      <w:r>
+        <w:rPr>
+          <w:rFonts w:ascii="Arial" w:hAnsi="Arial"/>
+          <w:b/>
+          <w:color w:val="2563EB"/>
+          <w:sz w:val="22"/>
+        </w:rPr>
+        <w:t>[Слайд 8]</w:t>
+      </w:r>
+    </w:p>
+    <w:p>
+      <w:pPr>
+        <w:jc w:val="both"/>
+      </w:pPr>
+      <w:r>
+        <w:t>Предварительный анализ показал различия между языками. Доля ошибок составила 14,8 процента для английского, 17,8 процента для русского и 26,5 процента для казахского языка.</w:t>
+      </w:r>
+    </w:p>
+    <w:p>
+      <w:pPr>
+        <w:jc w:val="both"/>
+      </w:pPr>
+      <w:r>
+        <w:t>Это результат данного набора вопросов. Он показывает, что качество нужно отдельно контролировать для каждого языка.</w:t>
+      </w:r>
+    </w:p>
+    <w:p>
+      <w:pPr>
+        <w:spacing w:before="160" w:after="60"/>
+      </w:pPr>
+      <w:r>
+        <w:rPr>
+          <w:rFonts w:ascii="Arial" w:hAnsi="Arial"/>
+          <w:b/>
+          <w:color w:val="2563EB"/>
+          <w:sz w:val="22"/>
+        </w:rPr>
+        <w:t>[Слайд 9]</w:t>
+      </w:r>
+    </w:p>
+    <w:p>
+      <w:pPr>
+        <w:jc w:val="both"/>
+      </w:pPr>
+      <w:r>
+        <w:t>Модели тоже различались. Доля ошибок находилась в диапазоне от 14,7 до 23,2 процента. Разница между лучшим и худшим результатом составила 8,5 процентного пункта.</w:t>
+      </w:r>
+    </w:p>
+    <w:p>
+      <w:pPr>
+        <w:spacing w:before="160" w:after="60"/>
+      </w:pPr>
+      <w:r>
+        <w:rPr>
+          <w:rFonts w:ascii="Arial" w:hAnsi="Arial"/>
+          <w:b/>
+          <w:color w:val="2563EB"/>
+          <w:sz w:val="22"/>
+        </w:rPr>
+        <w:t>[Слайд 10]</w:t>
+      </w:r>
+    </w:p>
+    <w:p>
+      <w:pPr>
+        <w:jc w:val="both"/>
+      </w:pPr>
+      <w:r>
+        <w:t>Ещё сильнее результат зависел от категории. Наибольшая доля ошибок появилась в вопросах о Казахстане, 52,1 процента, и в вопросах с ложной предпосылкой, 31,6 процента.</w:t>
+      </w:r>
+    </w:p>
+    <w:p>
+      <w:pPr>
+        <w:jc w:val="both"/>
+      </w:pPr>
+      <w:r>
+        <w:t>Этот вывод относится к нашему benchmark. Для других тем распределение может отличаться.</w:t>
+      </w:r>
+    </w:p>
+    <w:p>
+      <w:pPr>
+        <w:spacing w:before="160" w:after="60"/>
+      </w:pPr>
+      <w:r>
+        <w:rPr>
+          <w:rFonts w:ascii="Arial" w:hAnsi="Arial"/>
+          <w:b/>
+          <w:color w:val="2563EB"/>
+          <w:sz w:val="22"/>
+        </w:rPr>
+        <w:t>[Слайд 11]</w:t>
+      </w:r>
+    </w:p>
+    <w:p>
+      <w:pPr>
+        <w:jc w:val="both"/>
+      </w:pPr>
+      <w:r>
+        <w:t>Главный результат получен на закрытом тесте из 131 случая. Динамическая модель достигла AUROC 0,879 и AUPRC 0,622.</w:t>
+      </w:r>
+    </w:p>
+    <w:p>
+      <w:pPr>
+        <w:jc w:val="both"/>
+      </w:pPr>
+      <w:r>
+        <w:t>AUROC показывает качество ранжирования ответов по риску. Значение 0,5 соответствует случайному результату, а 1 соответствует идеальному разделению.</w:t>
+      </w:r>
+    </w:p>
+    <w:p>
+      <w:pPr>
+        <w:spacing w:before="160" w:after="60"/>
+      </w:pPr>
+      <w:r>
+        <w:rPr>
+          <w:rFonts w:ascii="Arial" w:hAnsi="Arial"/>
+          <w:b/>
+          <w:color w:val="2563EB"/>
+          <w:sz w:val="22"/>
+        </w:rPr>
+        <w:t>[Слайд 12]</w:t>
+      </w:r>
+    </w:p>
+    <w:p>
+      <w:pPr>
+        <w:jc w:val="both"/>
+      </w:pPr>
+      <w:r>
+        <w:t>Статический подход использовал только итоговые признаки после пяти ответов и получил AUROC 0,842. Динамический подход учитывал изменение признаков от второго до пятого ответа и получил 0,879.</w:t>
+      </w:r>
+    </w:p>
+    <w:p>
+      <w:pPr>
+        <w:jc w:val="both"/>
+      </w:pPr>
+      <w:r>
+        <w:t>Улучшение составило 0,038. Доверительный интервал разницы находится от 0,001 до 0,084 и не включает ноль. Это поддерживает гипотезу проекта.</w:t>
       </w:r>
     </w:p>
     <w:p>
@@ -268,7 +408,15 @@
         <w:jc w:val="both"/>
       </w:pPr>
       <w:r>
-        <w:t>Практическое применение проекта состоит в приоритизации проверки. Система присваивает каждому ответу оценку риска. Ответы с высоким риском можно направить человеку или внешнему источнику для проверки в первую очередь. Такой подход сокращает объём ручной работы, когда ответов много.</w:t>
+        <w:t>Для воспроизводимости каждый запрос получил стабильный ключ. Ответы сохранялись в SQLite. Система поддерживает повторные попытки после ошибок API, проверяет хэши входных файлов и не записывает один ответ дважды.</w:t>
+      </w:r>
+    </w:p>
+    <w:p>
+      <w:pPr>
+        <w:jc w:val="both"/>
+      </w:pPr>
+      <w:r>
+        <w:t>Код, данные, модели и инструкция локального запуска опубликованы в GitHub.</w:t>
       </w:r>
     </w:p>
     <w:p>
@@ -282,7 +430,7 @@
           <w:color w:val="2563EB"/>
           <w:sz w:val="22"/>
         </w:rPr>
-        <w:t>[Слайды 14 и 15]</w:t>
+        <w:t>[Слайд 14]</w:t>
       </w:r>
     </w:p>
     <w:p>
@@ -290,7 +438,7 @@
         <w:jc w:val="both"/>
       </w:pPr>
       <w:r>
-        <w:t>У исследования есть ограничения. Это пилотный эксперимент на 100 фактах. При выбранном пороге модель обнаруживает около одной трети фактических ошибок, поэтому её пока нельзя использовать как единственный способ контроля. Смысловые группы также требуют независимой человеческой проверки. Для неё подготовлена слепая выборка из 200 случаев.</w:t>
+        <w:t>Все вычислительные этапы пилота завершены: датасет, сбор ответов, фактическая разметка, смысловая группировка, обучение моделей и закрытый тест.</w:t>
       </w:r>
     </w:p>
     <w:p>
@@ -298,7 +446,45 @@
         <w:jc w:val="both"/>
       </w:pPr>
       <w:r>
-        <w:t>Я делаю следующий вывод: динамика повторных ответов помогает оценивать риск фактической ошибки лучше, чем итоговая согласованность сама по себе. Код, данные, настройки эксперимента и результаты опубликованы в GitHub, поэтому работу можно воспроизвести на другом компьютере.</w:t>
+        <w:t>Следующий научный этап состоит в независимой человеческой проверке 200 случаев смысловой группировки.</w:t>
+      </w:r>
+    </w:p>
+    <w:p>
+      <w:pPr>
+        <w:spacing w:before="160" w:after="60"/>
+      </w:pPr>
+      <w:r>
+        <w:rPr>
+          <w:rFonts w:ascii="Arial" w:hAnsi="Arial"/>
+          <w:b/>
+          <w:color w:val="2563EB"/>
+          <w:sz w:val="22"/>
+        </w:rPr>
+        <w:t>[Слайд 15]</w:t>
+      </w:r>
+    </w:p>
+    <w:p>
+      <w:pPr>
+        <w:jc w:val="both"/>
+      </w:pPr>
+      <w:r>
+        <w:t>Итоговый вывод: динамика согласованности действительно добавила сигнал и улучшила AUROC на 0,038.</w:t>
+      </w:r>
+    </w:p>
+    <w:p>
+      <w:pPr>
+        <w:jc w:val="both"/>
+      </w:pPr>
+      <w:r>
+        <w:t>Практически модель может присваивать ответам уровень риска и направлять самые подозрительные ответы на проверку в первую очередь.</w:t>
+      </w:r>
+    </w:p>
+    <w:p>
+      <w:pPr>
+        <w:jc w:val="both"/>
+      </w:pPr>
+      <w:r>
+        <w:t>Ограничение проекта: при выбранном пороге система обнаруживает около трети ошибок. Поэтому она помогает расставить приоритеты, а окончательную проверку выполняет человек.</w:t>
       </w:r>
     </w:p>
     <w:p>
@@ -319,7 +505,7 @@
           <w:b/>
           <w:sz w:val="30"/>
         </w:rPr>
-        <w:t>Краткое объяснение проекта</w:t>
+        <w:t>Объяснение проекта одним предложением</w:t>
       </w:r>
     </w:p>
     <w:p>
@@ -327,7 +513,7 @@
         <w:jc w:val="both"/>
       </w:pPr>
       <w:r>
-        <w:t>Я задаю языковой модели один вопрос несколько раз и анализирую, как меняется смысл её ответов. Чем менее стабильны ответы, тем выше предполагаемый риск ошибки в первоначальном ответе.</w:t>
+        <w:t>Я несколько раз задаю искусственному интеллекту один вопрос и по изменению смысла его ответов оцениваю риск ошибки в первоначальном ответе.</w:t>
       </w:r>
     </w:p>
     <w:p>
@@ -348,7 +534,7 @@
         <w:jc w:val="both"/>
       </w:pPr>
       <w:r>
-        <w:t>В чём научная новизна работы?</w:t>
+        <w:t>В чём новизна?</w:t>
       </w:r>
     </w:p>
     <w:p>
@@ -356,7 +542,7 @@
         <w:jc w:val="both"/>
       </w:pPr>
       <w:r>
-        <w:t>Я использую траекторию признаков после каждой новой генерации. Статический подход видит только итог после пяти ответов, а мой подход учитывает процесс изменения согласованности.</w:t>
+        <w:t>Обычный подход смотрит на итог после пяти ответов. Мой подход также учитывает, как показатели менялись после каждой новой генерации.</w:t>
       </w:r>
     </w:p>
     <w:p>
@@ -364,7 +550,7 @@
         <w:jc w:val="both"/>
       </w:pPr>
       <w:r>
-        <w:t>Что такое семантическая согласованность?</w:t>
+        <w:t>Что такое семантика?</w:t>
       </w:r>
     </w:p>
     <w:p>
@@ -372,7 +558,7 @@
         <w:jc w:val="both"/>
       </w:pPr>
       <w:r>
-        <w:t>Это степень совпадения ответов по смыслу. Разные формулировки считаются согласованными, если они сообщают один и тот же факт.</w:t>
+        <w:t>Семантика означает смысл. Разные формулировки относятся к одной группе, если сообщают один факт.</w:t>
       </w:r>
     </w:p>
     <w:p>
@@ -388,7 +574,7 @@
         <w:jc w:val="both"/>
       </w:pPr>
       <w:r>
-        <w:t>Это численная мера смыслового разброса. Она растёт, когда ответы распределяются между несколькими разными версиями.</w:t>
+        <w:t>Это мера смыслового разброса. Чем больше разных версий ответа, тем выше энтропия.</w:t>
       </w:r>
     </w:p>
     <w:p>
@@ -404,7 +590,7 @@
         <w:jc w:val="both"/>
       </w:pPr>
       <w:r>
-        <w:t>Показатель оценивает качество ранжирования по риску. Чем он ближе к единице, тем чаще ошибочный ответ получает больший риск, чем правильный.</w:t>
+        <w:t>Чем показатель ближе к единице, тем чаще ошибочный ответ получает больший риск, чем правильный.</w:t>
       </w:r>
     </w:p>
     <w:p>
@@ -412,7 +598,7 @@
         <w:jc w:val="both"/>
       </w:pPr>
       <w:r>
-        <w:t>Почему использовано пять повторных ответов?</w:t>
+        <w:t>Почему пять повторных ответов?</w:t>
       </w:r>
     </w:p>
     <w:p>
@@ -420,7 +606,7 @@
         <w:jc w:val="both"/>
       </w:pPr>
       <w:r>
-        <w:t>Пять ответов дают возможность проследить несколько шагов изменения и при этом сохраняют приемлемую стоимость эксперимента.</w:t>
+        <w:t>Они дают несколько шагов для анализа динамики при приемлемом числе API-запросов.</w:t>
       </w:r>
     </w:p>
     <w:p>
@@ -428,7 +614,7 @@
         <w:jc w:val="both"/>
       </w:pPr>
       <w:r>
-        <w:t>Можно ли считать гипотезу доказанной?</w:t>
+        <w:t>Почему результаты по Казахстану хуже?</w:t>
       </w:r>
     </w:p>
     <w:p>
@@ -436,7 +622,7 @@
         <w:jc w:val="both"/>
       </w:pPr>
       <w:r>
-        <w:t>Результаты пилотного эксперимента поддерживают гипотезу. Для более общего вывода потребуется увеличить benchmark и провести независимую человеческую проверку смысловых групп.</w:t>
+        <w:t>В нашем benchmark модели чаще ошибались на локальных именах, государственных символах и объектах Казахстана. Этот результат нельзя автоматически переносить на все возможные вопросы.</w:t>
       </w:r>
     </w:p>
     <w:p>
@@ -444,7 +630,7 @@
         <w:jc w:val="both"/>
       </w:pPr>
       <w:r>
-        <w:t>Какое главное ограничение модели?</w:t>
+        <w:t>Гипотеза доказана?</w:t>
       </w:r>
     </w:p>
     <w:p>
@@ -452,7 +638,7 @@
         <w:jc w:val="both"/>
       </w:pPr>
       <w:r>
-        <w:t>При выбранном пороге она обнаруживает около трети ошибок. Сейчас её следует использовать для определения приоритета проверки, а не для окончательного решения.</w:t>
+        <w:t>Пилотный результат поддерживает гипотезу. Для общего вывода нужны более крупный benchmark и независимая человеческая проверка смысловых групп.</w:t>
       </w:r>
     </w:p>
     <w:p>
@@ -473,7 +659,7 @@
         <w:jc w:val="both"/>
       </w:pPr>
       <w:r>
-        <w:t>Здравствуйте. Меня зовут Саурыков Ихсан, я ученик 12D класса. Я исследовал, можно ли прогнозировать фактические ошибки языковой модели по изменению её повторных ответов.</w:t>
+        <w:t>Здравствуйте. Меня зовут Саурыков Ихсан. Я исследовал, можно ли прогнозировать фактические ошибки искусственного интеллекта по изменению повторных ответов.</w:t>
       </w:r>
     </w:p>
     <w:p>
@@ -481,7 +667,7 @@
         <w:jc w:val="both"/>
       </w:pPr>
       <w:r>
-        <w:t>Для эксперимента я подготовил 100 проверенных фактов на английском, русском и казахском языках. Три модели отвечали на каждый вопрос шесть раз. Всего было собрано 5 400 ответов.</w:t>
+        <w:t>Я подготовил 100 проверенных фактов на трёх языках. Три модели дали 5 400 ответов. Программа объединяла повторные ответы по смыслу и следила, как их согласованность меняется от второй до пятой генерации.</w:t>
       </w:r>
     </w:p>
     <w:p>
@@ -489,7 +675,7 @@
         <w:jc w:val="both"/>
       </w:pPr>
       <w:r>
-        <w:t>Программа измеряла, насколько ответы совпадают по смыслу и как эта согласованность меняется после каждой генерации. На закрытом тесте динамический подход получил AUROC 0,879, а статический подход с одной итоговой оценкой получил 0,842. Статистическая проверка поддержала преимущество динамического подхода.</w:t>
+        <w:t>На закрытом тесте динамический подход получил AUROC 0,879, а статический подход с одной итоговой оценкой получил 0,842. Улучшение составило 0,038 и прошло статистическую проверку.</w:t>
       </w:r>
     </w:p>
     <w:p>
@@ -497,7 +683,7 @@
         <w:jc w:val="both"/>
       </w:pPr>
       <w:r>
-        <w:t>Полученный сигнал риска можно использовать, чтобы направлять наиболее подозрительные ответы на дополнительную проверку. Проект является пилотным, поэтому следующим этапом станет расширение benchmark и независимая проверка смысловой разметки. Спасибо за внимание.</w:t>
+        <w:t>Метод может определять ответы с высоким риском и направлять их на проверку в первую очередь. Проект является пилотным, поэтому следующим этапом станет расширение данных и человеческая проверка смысловой разметки. Спасибо.</w:t>
       </w:r>
     </w:p>
     <w:sectPr>

</xml_diff>